<commit_message>
UI improvement and incident cards' bug fixes
</commit_message>
<xml_diff>
--- a/游戏规则v1.4.3.docx
+++ b/游戏规则v1.4.3.docx
@@ -2912,7 +2912,21 @@
           <w:rFonts w:hint="eastAsia"/>
           <w:color w:val="00B050"/>
         </w:rPr>
-        <w:t>愿打愿挨：技能卡，使用此技能卡指定一个单位，使其在本大回合参与的战斗roll点+1，此后防御力永久-1</w:t>
+        <w:t>愿打愿挨</w:t>
+      </w:r>
+      <w:r>
+        <w:rPr>
+          <w:rFonts w:hint="eastAsia"/>
+          <w:color w:val="00B050"/>
+        </w:rPr>
+        <w:t>（吴）</w:t>
+      </w:r>
+      <w:r>
+        <w:rPr>
+          <w:rFonts w:hint="eastAsia"/>
+          <w:color w:val="00B050"/>
+        </w:rPr>
+        <w:t>：技能卡，使用此技能卡指定一个单位，使其在本大回合参与的战斗roll点+1，此后防御力永久-1</w:t>
       </w:r>
     </w:p>
     <w:p>

</xml_diff>

<commit_message>
incident card UI improvement and rule clarifications
</commit_message>
<xml_diff>
--- a/游戏规则v1.4.3.docx
+++ b/游戏规则v1.4.3.docx
@@ -2807,21 +2807,35 @@
           <w:rFonts w:hint="eastAsia"/>
           <w:color w:val="00B050"/>
         </w:rPr>
-        <w:t>联刘抗曹（吴）：本回合蜀汉和东吴单位不能相互攻击</w:t>
-      </w:r>
-    </w:p>
-    <w:p>
-      <w:pPr>
+        <w:t>联刘抗曹（吴）：本</w:t>
+      </w:r>
+      <w:r>
         <w:rPr>
           <w:rFonts w:hint="eastAsia"/>
           <w:color w:val="00B050"/>
         </w:rPr>
-      </w:pPr>
+        <w:t>小</w:t>
+      </w:r>
       <w:r>
         <w:rPr>
           <w:rFonts w:hint="eastAsia"/>
           <w:color w:val="00B050"/>
         </w:rPr>
+        <w:t>回合蜀汉和东吴单位不能相互攻击</w:t>
+      </w:r>
+    </w:p>
+    <w:p>
+      <w:pPr>
+        <w:rPr>
+          <w:rFonts w:hint="eastAsia"/>
+          <w:color w:val="00B050"/>
+        </w:rPr>
+      </w:pPr>
+      <w:r>
+        <w:rPr>
+          <w:rFonts w:hint="eastAsia"/>
+          <w:color w:val="00B050"/>
+        </w:rPr>
         <w:t>荆州之主（吴）：若荆州属于东吴控制，则东吴获得1张技能牌——进攻蜀汉单位时roll点+1</w:t>
       </w:r>
     </w:p>
@@ -2867,21 +2881,35 @@
           <w:rFonts w:hint="eastAsia"/>
           <w:color w:val="00B050"/>
         </w:rPr>
-        <w:t>舍身护主（吴）：本回合东吴进行防御战时，所有部队防御+1</w:t>
-      </w:r>
-    </w:p>
-    <w:p>
-      <w:pPr>
+        <w:t>舍身护主（吴）：本</w:t>
+      </w:r>
+      <w:r>
         <w:rPr>
           <w:rFonts w:hint="eastAsia"/>
           <w:color w:val="00B050"/>
         </w:rPr>
-      </w:pPr>
+        <w:t>大</w:t>
+      </w:r>
       <w:r>
         <w:rPr>
           <w:rFonts w:hint="eastAsia"/>
           <w:color w:val="00B050"/>
         </w:rPr>
+        <w:t>回合东吴进行防御战时，所有部队防御+1</w:t>
+      </w:r>
+    </w:p>
+    <w:p>
+      <w:pPr>
+        <w:rPr>
+          <w:rFonts w:hint="eastAsia"/>
+          <w:color w:val="00B050"/>
+        </w:rPr>
+      </w:pPr>
+      <w:r>
+        <w:rPr>
+          <w:rFonts w:hint="eastAsia"/>
+          <w:color w:val="00B050"/>
+        </w:rPr>
         <w:t>偏安一隅（吴）：东吴民心-1</w:t>
       </w:r>
     </w:p>
@@ -2897,21 +2925,35 @@
           <w:rFonts w:hint="eastAsia"/>
           <w:color w:val="00B050"/>
         </w:rPr>
-        <w:t>老迈昏聩（吴）：下一回合若抽到“江东才俊”，无效</w:t>
-      </w:r>
-    </w:p>
-    <w:p>
-      <w:pPr>
+        <w:t>老迈昏聩（吴）：下一</w:t>
+      </w:r>
+      <w:r>
         <w:rPr>
           <w:rFonts w:hint="eastAsia"/>
           <w:color w:val="00B050"/>
         </w:rPr>
-      </w:pPr>
+        <w:t>次抽卡</w:t>
+      </w:r>
       <w:r>
         <w:rPr>
           <w:rFonts w:hint="eastAsia"/>
           <w:color w:val="00B050"/>
         </w:rPr>
+        <w:t>若抽到“江东才俊”，无效</w:t>
+      </w:r>
+    </w:p>
+    <w:p>
+      <w:pPr>
+        <w:rPr>
+          <w:rFonts w:hint="eastAsia"/>
+          <w:color w:val="00B050"/>
+        </w:rPr>
+      </w:pPr>
+      <w:r>
+        <w:rPr>
+          <w:rFonts w:hint="eastAsia"/>
+          <w:color w:val="00B050"/>
+        </w:rPr>
         <w:t>愿打愿挨</w:t>
       </w:r>
       <w:r>
@@ -2970,14 +3012,6 @@
       <w:pPr>
         <w:rPr>
           <w:rFonts w:hint="eastAsia"/>
-          <w:color w:val="00B050"/>
-        </w:rPr>
-      </w:pPr>
-    </w:p>
-    <w:p>
-      <w:pPr>
-        <w:rPr>
-          <w:rFonts w:hint="eastAsia"/>
           <w:color w:val="0070C0"/>
         </w:rPr>
       </w:pPr>
@@ -3001,21 +3035,35 @@
           <w:rFonts w:hint="eastAsia"/>
           <w:color w:val="0070C0"/>
         </w:rPr>
-        <w:t>五子良将（魏）：五个小回合内曹魏进攻时所有部队攻击+1，至多+3</w:t>
-      </w:r>
-    </w:p>
-    <w:p>
-      <w:pPr>
+        <w:t>五子良将（魏）：</w:t>
+      </w:r>
+      <w:r>
         <w:rPr>
           <w:rFonts w:hint="eastAsia"/>
           <w:color w:val="0070C0"/>
         </w:rPr>
-      </w:pPr>
+        <w:t>本大回合</w:t>
+      </w:r>
       <w:r>
         <w:rPr>
           <w:rFonts w:hint="eastAsia"/>
           <w:color w:val="0070C0"/>
         </w:rPr>
+        <w:t>内曹魏进攻时所有部队攻击+1，至多+3</w:t>
+      </w:r>
+    </w:p>
+    <w:p>
+      <w:pPr>
+        <w:rPr>
+          <w:rFonts w:hint="eastAsia"/>
+          <w:color w:val="0070C0"/>
+        </w:rPr>
+      </w:pPr>
+      <w:r>
+        <w:rPr>
+          <w:rFonts w:hint="eastAsia"/>
+          <w:color w:val="0070C0"/>
+        </w:rPr>
         <w:t>国贼蛰伏（魏）：曹魏政治点数-1</w:t>
       </w:r>
     </w:p>
@@ -3031,21 +3079,35 @@
           <w:rFonts w:hint="eastAsia"/>
           <w:color w:val="0070C0"/>
         </w:rPr>
-        <w:t>胡人袭扰（魏）：曹魏本回合不能使用政治点数招募新的部队</w:t>
-      </w:r>
-    </w:p>
-    <w:p>
-      <w:pPr>
+        <w:t>胡人袭扰（魏）：曹魏本</w:t>
+      </w:r>
+      <w:r>
         <w:rPr>
           <w:rFonts w:hint="eastAsia"/>
           <w:color w:val="0070C0"/>
         </w:rPr>
-      </w:pPr>
+        <w:t>大</w:t>
+      </w:r>
       <w:r>
         <w:rPr>
           <w:rFonts w:hint="eastAsia"/>
           <w:color w:val="0070C0"/>
         </w:rPr>
+        <w:t>回合不能使用政治点数招募新的部队</w:t>
+      </w:r>
+    </w:p>
+    <w:p>
+      <w:pPr>
+        <w:rPr>
+          <w:rFonts w:hint="eastAsia"/>
+          <w:color w:val="0070C0"/>
+        </w:rPr>
+      </w:pPr>
+      <w:r>
+        <w:rPr>
+          <w:rFonts w:hint="eastAsia"/>
+          <w:color w:val="0070C0"/>
+        </w:rPr>
         <w:t>篡权夺位（魏）：曹魏民心-1</w:t>
       </w:r>
     </w:p>
@@ -3061,22 +3123,21 @@
           <w:rFonts w:hint="eastAsia"/>
           <w:color w:val="0070C0"/>
         </w:rPr>
-        <w:t>入主汉中（魏）：若汉中被曹魏占领，则曹魏本回合政治点数+2</w:t>
-      </w:r>
-    </w:p>
-    <w:p>
-      <w:pPr>
+        <w:t>入主汉中（魏）：若汉中被曹魏占领，则曹魏本</w:t>
+      </w:r>
+      <w:r>
         <w:rPr>
           <w:rFonts w:hint="eastAsia"/>
           <w:color w:val="0070C0"/>
         </w:rPr>
-      </w:pPr>
+        <w:t>小</w:t>
+      </w:r>
       <w:r>
         <w:rPr>
           <w:rFonts w:hint="eastAsia"/>
           <w:color w:val="0070C0"/>
         </w:rPr>
-        <w:t>吴魏媾和（魏）：东吴政治点数+1，但本回合不能进攻曹魏</w:t>
+        <w:t>回合政治点数+2</w:t>
       </w:r>
     </w:p>
     <w:p>
@@ -3091,6 +3152,35 @@
           <w:rFonts w:hint="eastAsia"/>
           <w:color w:val="0070C0"/>
         </w:rPr>
+        <w:t>吴魏媾和（魏）：东吴政治点数+1，但本</w:t>
+      </w:r>
+      <w:r>
+        <w:rPr>
+          <w:rFonts w:hint="eastAsia"/>
+          <w:color w:val="0070C0"/>
+        </w:rPr>
+        <w:t>小</w:t>
+      </w:r>
+      <w:r>
+        <w:rPr>
+          <w:rFonts w:hint="eastAsia"/>
+          <w:color w:val="0070C0"/>
+        </w:rPr>
+        <w:t>回合不能进攻曹魏</w:t>
+      </w:r>
+    </w:p>
+    <w:p>
+      <w:pPr>
+        <w:rPr>
+          <w:rFonts w:hint="eastAsia"/>
+          <w:color w:val="0070C0"/>
+        </w:rPr>
+      </w:pPr>
+      <w:r>
+        <w:rPr>
+          <w:rFonts w:hint="eastAsia"/>
+          <w:color w:val="0070C0"/>
+        </w:rPr>
         <w:t>挟帝发令</w:t>
       </w:r>
       <w:r>
@@ -3105,15 +3195,29 @@
           <w:rFonts w:hint="eastAsia"/>
           <w:color w:val="0070C0"/>
         </w:rPr>
-        <w:t>：技能卡使用此技能卡，指定某单位，永久提升1点攻击力</w:t>
-      </w:r>
-    </w:p>
-    <w:p>
-      <w:pPr>
+        <w:t>：</w:t>
+      </w:r>
+      <w:r>
         <w:rPr>
           <w:rFonts w:hint="eastAsia"/>
           <w:color w:val="0070C0"/>
         </w:rPr>
+        <w:t>技能卡，</w:t>
+      </w:r>
+      <w:r>
+        <w:rPr>
+          <w:rFonts w:hint="eastAsia"/>
+          <w:color w:val="0070C0"/>
+        </w:rPr>
+        <w:t>使用此技能卡，指定某单位，永久提升1点攻击力</w:t>
+      </w:r>
+    </w:p>
+    <w:p>
+      <w:pPr>
+        <w:rPr>
+          <w:rFonts w:hint="eastAsia"/>
+          <w:color w:val="0070C0"/>
+        </w:rPr>
       </w:pPr>
     </w:p>
     <w:p>
@@ -3139,34 +3243,69 @@
         <w:rPr>
           <w:rFonts w:hint="eastAsia"/>
         </w:rPr>
-        <w:t>奖率三军：在本大回合内，所有单位进攻roll点计算+1</w:t>
-      </w:r>
-    </w:p>
-    <w:p>
-      <w:pPr>
-        <w:rPr>
-          <w:rFonts w:hint="eastAsia"/>
-        </w:rPr>
-      </w:pPr>
-      <w:r>
-        <w:rPr>
-          <w:rFonts w:hint="eastAsia"/>
-        </w:rPr>
-        <w:t>老骥伏枥：增加2点只能在本回合使用的政治点数</w:t>
-      </w:r>
-    </w:p>
-    <w:p>
-      <w:pPr>
-        <w:rPr>
-          <w:rFonts w:hint="eastAsia"/>
-        </w:rPr>
-      </w:pPr>
-      <w:r>
-        <w:rPr>
-          <w:rFonts w:hint="eastAsia"/>
-        </w:rPr>
-        <w:lastRenderedPageBreak/>
-        <w:t>厉兵秣马：指定一个单位，使其在本回合参与的战斗roll点+1，</w:t>
+        <w:t>奖率三军：在本</w:t>
+      </w:r>
+      <w:r>
+        <w:rPr>
+          <w:rFonts w:hint="eastAsia"/>
+        </w:rPr>
+        <w:t>小</w:t>
+      </w:r>
+      <w:r>
+        <w:rPr>
+          <w:rFonts w:hint="eastAsia"/>
+        </w:rPr>
+        <w:t>回合内，所有单位进攻roll点计算+1</w:t>
+      </w:r>
+    </w:p>
+    <w:p>
+      <w:pPr>
+        <w:rPr>
+          <w:rFonts w:hint="eastAsia"/>
+        </w:rPr>
+      </w:pPr>
+      <w:r>
+        <w:rPr>
+          <w:rFonts w:hint="eastAsia"/>
+        </w:rPr>
+        <w:t>老骥伏枥：增加2点只能在本</w:t>
+      </w:r>
+      <w:r>
+        <w:rPr>
+          <w:rFonts w:hint="eastAsia"/>
+        </w:rPr>
+        <w:t>小</w:t>
+      </w:r>
+      <w:r>
+        <w:rPr>
+          <w:rFonts w:hint="eastAsia"/>
+        </w:rPr>
+        <w:t>回合使用的政治点数</w:t>
+      </w:r>
+    </w:p>
+    <w:p>
+      <w:pPr>
+        <w:rPr>
+          <w:rFonts w:hint="eastAsia"/>
+        </w:rPr>
+      </w:pPr>
+      <w:r>
+        <w:rPr>
+          <w:rFonts w:hint="eastAsia"/>
+        </w:rPr>
+        <w:t>厉兵秣马：指定一个单位，使其在本</w:t>
+      </w:r>
+      <w:r>
+        <w:rPr>
+          <w:rFonts w:hint="eastAsia"/>
+        </w:rPr>
+        <w:t>小</w:t>
+      </w:r>
+      <w:r>
+        <w:rPr>
+          <w:rFonts w:hint="eastAsia"/>
+        </w:rPr>
+        <w:t>回合参与的战斗roll点+1，</w:t>
       </w:r>
     </w:p>
     <w:p>

</xml_diff>